<commit_message>
Specification v1.1: screenshots appendix, feature coverage, explicit mock-backend statements
Co-Authored-By: Claude Fable 5 <noreply@anthropic.com>
</commit_message>
<xml_diff>
--- a/docs/Health-Savvy-Scope-and-Specification.docx
+++ b/docs/Health-Savvy-Scope-and-Specification.docx
@@ -345,7 +345,7 @@
                 <w:sz w:val="19"/>
                 <w:szCs w:val="19"/>
               </w:rPr>
-              <w:t xml:space="preserve">1.0</w:t>
+              <w:t xml:space="preserve">1.1</w:t>
             </w:r>
           </w:p>
         </w:tc>
@@ -410,7 +410,7 @@
                 <w:sz w:val="19"/>
                 <w:szCs w:val="19"/>
               </w:rPr>
-              <w:t xml:space="preserve">15 July 2026</w:t>
+              <w:t xml:space="preserve">16 July 2026</w:t>
             </w:r>
           </w:p>
         </w:tc>
@@ -475,7 +475,7 @@
                 <w:sz w:val="19"/>
                 <w:szCs w:val="19"/>
               </w:rPr>
-              <w:t xml:space="preserve">Baseline — aligned to client feedback of 12 Jul 2026</w:t>
+              <w:t xml:space="preserve">Baseline — aligned to client feedback of 12 Jul 2026 and reviewer confirmations of 15 Jul 2026</w:t>
             </w:r>
           </w:p>
         </w:tc>
@@ -541,6 +541,71 @@
                 <w:szCs w:val="19"/>
               </w:rPr>
               <w:t xml:space="preserve">Mock / synthetic demonstration data only — no real patient, employee or claims data</w:t>
+            </w:r>
+          </w:p>
+        </w:tc>
+      </w:tr>
+      <w:tr>
+        <w:tc>
+          <w:tcPr>
+            <w:tcW w:type="dxa" w:w="2000"/>
+            <w:tcBorders>
+              <w:top w:val="single" w:color="CBD5E1" w:sz="4"/>
+              <w:left w:val="single" w:color="CBD5E1" w:sz="4"/>
+              <w:bottom w:val="single" w:color="CBD5E1" w:sz="4"/>
+              <w:right w:val="single" w:color="CBD5E1" w:sz="4"/>
+            </w:tcBorders>
+            <w:shd w:fill="EEF4FF" w:val="clear"/>
+            <w:tcMar>
+              <w:top w:type="dxa" w:w="80"/>
+              <w:left w:type="dxa" w:w="120"/>
+              <w:bottom w:type="dxa" w:w="80"/>
+              <w:right w:type="dxa" w:w="120"/>
+            </w:tcMar>
+          </w:tcPr>
+          <w:p>
+            <w:pPr>
+              <w:spacing w:after="0" w:line="260"/>
+            </w:pPr>
+            <w:r>
+              <w:rPr>
+                <w:b/>
+                <w:bCs/>
+                <w:color w:val="1E3A5F"/>
+                <w:sz w:val="19"/>
+                <w:szCs w:val="19"/>
+              </w:rPr>
+              <w:t xml:space="preserve">Backend</w:t>
+            </w:r>
+          </w:p>
+        </w:tc>
+        <w:tc>
+          <w:tcPr>
+            <w:tcW w:type="dxa" w:w="3200"/>
+            <w:tcBorders>
+              <w:top w:val="single" w:color="CBD5E1" w:sz="4"/>
+              <w:left w:val="single" w:color="CBD5E1" w:sz="4"/>
+              <w:bottom w:val="single" w:color="CBD5E1" w:sz="4"/>
+              <w:right w:val="single" w:color="CBD5E1" w:sz="4"/>
+            </w:tcBorders>
+            <w:tcMar>
+              <w:top w:type="dxa" w:w="80"/>
+              <w:left w:type="dxa" w:w="120"/>
+              <w:bottom w:type="dxa" w:w="80"/>
+              <w:right w:type="dxa" w:w="120"/>
+            </w:tcMar>
+          </w:tcPr>
+          <w:p>
+            <w:pPr>
+              <w:spacing w:after="0" w:line="260"/>
+            </w:pPr>
+            <w:r>
+              <w:rPr>
+                <w:color w:val="1E293B"/>
+                <w:sz w:val="19"/>
+                <w:szCs w:val="19"/>
+              </w:rPr>
+              <w:t xml:space="preserve">Completely mocked — no server, no database, no system integrations; all data lives in the browser</w:t>
             </w:r>
           </w:p>
         </w:tc>
@@ -1228,6 +1293,132 @@
           </w:p>
         </w:tc>
       </w:tr>
+      <w:tr>
+        <w:tc>
+          <w:tcPr>
+            <w:tcW w:type="dxa" w:w="1100"/>
+            <w:tcBorders>
+              <w:top w:val="single" w:color="CBD5E1" w:sz="4"/>
+              <w:left w:val="single" w:color="CBD5E1" w:sz="4"/>
+              <w:bottom w:val="single" w:color="CBD5E1" w:sz="4"/>
+              <w:right w:val="single" w:color="CBD5E1" w:sz="4"/>
+            </w:tcBorders>
+            <w:shd w:fill="F1F5F9" w:val="clear"/>
+            <w:tcMar>
+              <w:top w:type="dxa" w:w="80"/>
+              <w:left w:type="dxa" w:w="120"/>
+              <w:bottom w:type="dxa" w:w="80"/>
+              <w:right w:type="dxa" w:w="120"/>
+            </w:tcMar>
+          </w:tcPr>
+          <w:p>
+            <w:pPr>
+              <w:spacing w:after="0" w:line="260"/>
+            </w:pPr>
+            <w:r>
+              <w:rPr>
+                <w:color w:val="1E293B"/>
+                <w:sz w:val="19"/>
+                <w:szCs w:val="19"/>
+              </w:rPr>
+              <w:t xml:space="preserve">1.1</w:t>
+            </w:r>
+          </w:p>
+        </w:tc>
+        <w:tc>
+          <w:tcPr>
+            <w:tcW w:type="dxa" w:w="1400"/>
+            <w:tcBorders>
+              <w:top w:val="single" w:color="CBD5E1" w:sz="4"/>
+              <w:left w:val="single" w:color="CBD5E1" w:sz="4"/>
+              <w:bottom w:val="single" w:color="CBD5E1" w:sz="4"/>
+              <w:right w:val="single" w:color="CBD5E1" w:sz="4"/>
+            </w:tcBorders>
+            <w:shd w:fill="F1F5F9" w:val="clear"/>
+            <w:tcMar>
+              <w:top w:type="dxa" w:w="80"/>
+              <w:left w:type="dxa" w:w="120"/>
+              <w:bottom w:type="dxa" w:w="80"/>
+              <w:right w:type="dxa" w:w="120"/>
+            </w:tcMar>
+          </w:tcPr>
+          <w:p>
+            <w:pPr>
+              <w:spacing w:after="0" w:line="260"/>
+            </w:pPr>
+            <w:r>
+              <w:rPr>
+                <w:color w:val="1E293B"/>
+                <w:sz w:val="19"/>
+                <w:szCs w:val="19"/>
+              </w:rPr>
+              <w:t xml:space="preserve">16 Jul 2026</w:t>
+            </w:r>
+          </w:p>
+        </w:tc>
+        <w:tc>
+          <w:tcPr>
+            <w:tcW w:type="dxa" w:w="2600"/>
+            <w:tcBorders>
+              <w:top w:val="single" w:color="CBD5E1" w:sz="4"/>
+              <w:left w:val="single" w:color="CBD5E1" w:sz="4"/>
+              <w:bottom w:val="single" w:color="CBD5E1" w:sz="4"/>
+              <w:right w:val="single" w:color="CBD5E1" w:sz="4"/>
+            </w:tcBorders>
+            <w:shd w:fill="F1F5F9" w:val="clear"/>
+            <w:tcMar>
+              <w:top w:type="dxa" w:w="80"/>
+              <w:left w:type="dxa" w:w="120"/>
+              <w:bottom w:type="dxa" w:w="80"/>
+              <w:right w:type="dxa" w:w="120"/>
+            </w:tcMar>
+          </w:tcPr>
+          <w:p>
+            <w:pPr>
+              <w:spacing w:after="0" w:line="260"/>
+            </w:pPr>
+            <w:r>
+              <w:rPr>
+                <w:color w:val="1E293B"/>
+                <w:sz w:val="19"/>
+                <w:szCs w:val="19"/>
+              </w:rPr>
+              <w:t xml:space="preserve">NTT DATA Project Team</w:t>
+            </w:r>
+          </w:p>
+        </w:tc>
+        <w:tc>
+          <w:tcPr>
+            <w:tcW w:type="dxa" w:w="3926"/>
+            <w:tcBorders>
+              <w:top w:val="single" w:color="CBD5E1" w:sz="4"/>
+              <w:left w:val="single" w:color="CBD5E1" w:sz="4"/>
+              <w:bottom w:val="single" w:color="CBD5E1" w:sz="4"/>
+              <w:right w:val="single" w:color="CBD5E1" w:sz="4"/>
+            </w:tcBorders>
+            <w:shd w:fill="F1F5F9" w:val="clear"/>
+            <w:tcMar>
+              <w:top w:type="dxa" w:w="80"/>
+              <w:left w:type="dxa" w:w="120"/>
+              <w:bottom w:type="dxa" w:w="80"/>
+              <w:right w:type="dxa" w:w="120"/>
+            </w:tcMar>
+          </w:tcPr>
+          <w:p>
+            <w:pPr>
+              <w:spacing w:after="0" w:line="260"/>
+            </w:pPr>
+            <w:r>
+              <w:rPr>
+                <w:color w:val="1E293B"/>
+                <w:sz w:val="19"/>
+                <w:szCs w:val="19"/>
+              </w:rPr>
+              <w:t xml:space="preserve">Reviewer confirmations applied platform-wide; screenshots appendix added; mock backend and AI usage stated explicitly</w:t>
+            </w:r>
+          </w:p>
+        </w:tc>
+      </w:tr>
     </w:tbl>
     <w:p>
       <w:pPr>
@@ -1548,7 +1739,7 @@
           <w:sz w:val="22"/>
           <w:szCs w:val="22"/>
         </w:rPr>
-        <w:t xml:space="preserve">	8</w:t>
+        <w:t xml:space="preserve">	9</w:t>
       </w:r>
     </w:p>
     <w:p>
@@ -1577,7 +1768,7 @@
           <w:sz w:val="20"/>
           <w:szCs w:val="20"/>
         </w:rPr>
-        <w:t xml:space="preserve">	8</w:t>
+        <w:t xml:space="preserve">	9</w:t>
       </w:r>
     </w:p>
     <w:p>
@@ -1606,7 +1797,7 @@
           <w:sz w:val="20"/>
           <w:szCs w:val="20"/>
         </w:rPr>
-        <w:t xml:space="preserve">	8</w:t>
+        <w:t xml:space="preserve">	9</w:t>
       </w:r>
     </w:p>
     <w:p>
@@ -1635,7 +1826,7 @@
           <w:sz w:val="20"/>
           <w:szCs w:val="20"/>
         </w:rPr>
-        <w:t xml:space="preserve">	8</w:t>
+        <w:t xml:space="preserve">	9</w:t>
       </w:r>
     </w:p>
     <w:p>
@@ -1664,7 +1855,7 @@
           <w:sz w:val="20"/>
           <w:szCs w:val="20"/>
         </w:rPr>
-        <w:t xml:space="preserve">	9</w:t>
+        <w:t xml:space="preserve">	10</w:t>
       </w:r>
     </w:p>
     <w:p>
@@ -1692,7 +1883,7 @@
           <w:sz w:val="22"/>
           <w:szCs w:val="22"/>
         </w:rPr>
-        <w:t xml:space="preserve">	10</w:t>
+        <w:t xml:space="preserve">	11</w:t>
       </w:r>
     </w:p>
     <w:p>
@@ -1720,7 +1911,7 @@
           <w:sz w:val="22"/>
           <w:szCs w:val="22"/>
         </w:rPr>
-        <w:t xml:space="preserve">	12</w:t>
+        <w:t xml:space="preserve">	13</w:t>
       </w:r>
     </w:p>
     <w:p>
@@ -1748,7 +1939,7 @@
           <w:sz w:val="22"/>
           <w:szCs w:val="22"/>
         </w:rPr>
-        <w:t xml:space="preserve">	13</w:t>
+        <w:t xml:space="preserve">	14</w:t>
       </w:r>
     </w:p>
     <w:p>
@@ -1776,7 +1967,7 @@
           <w:sz w:val="22"/>
           <w:szCs w:val="22"/>
         </w:rPr>
-        <w:t xml:space="preserve">	14</w:t>
+        <w:t xml:space="preserve">	15</w:t>
       </w:r>
     </w:p>
     <w:p>
@@ -1804,7 +1995,7 @@
           <w:sz w:val="22"/>
           <w:szCs w:val="22"/>
         </w:rPr>
-        <w:t xml:space="preserve">	15</w:t>
+        <w:t xml:space="preserve">	16</w:t>
       </w:r>
     </w:p>
     <w:p>
@@ -1832,7 +2023,35 @@
           <w:sz w:val="22"/>
           <w:szCs w:val="22"/>
         </w:rPr>
-        <w:t xml:space="preserve">	16</w:t>
+        <w:t xml:space="preserve">	17</w:t>
+      </w:r>
+    </w:p>
+    <w:p>
+      <w:pPr>
+        <w:tabs>
+          <w:tab w:val="right" w:pos="9026" w:leader="dot"/>
+        </w:tabs>
+        <w:spacing w:after="100" w:line="280"/>
+      </w:pPr>
+      <w:r>
+        <w:rPr>
+          <w:b/>
+          <w:bCs/>
+          <w:color w:val="1E3A5F"/>
+          <w:sz w:val="22"/>
+          <w:szCs w:val="22"/>
+        </w:rPr>
+        <w:t xml:space="preserve">12. Appendix A — Feature Walkthrough (Screenshots)</w:t>
+      </w:r>
+      <w:r>
+        <w:rPr>
+          <w:b/>
+          <w:bCs/>
+          <w:color w:val="1E3A5F"/>
+          <w:sz w:val="22"/>
+          <w:szCs w:val="22"/>
+        </w:rPr>
+        <w:t xml:space="preserve">	18</w:t>
       </w:r>
     </w:p>
     <w:p>
@@ -1881,11 +2100,34 @@
       </w:pPr>
       <w:r>
         <w:rPr>
+          <w:b/>
+          <w:bCs/>
           <w:color w:val="1E293B"/>
           <w:sz w:val="21"/>
           <w:szCs w:val="21"/>
         </w:rPr>
-        <w:t xml:space="preserve">This document baselines the scope, personas, features, AI capabilities, requirements, specification, prerequisites, security posture, limitations and outcomes of the current release, fully aligned to the client feedback received on 12 July 2026.</w:t>
+        <w:t xml:space="preserve">Important: the current release is a front-end demonstration. The backend is completely mocked</w:t>
+      </w:r>
+      <w:r>
+        <w:rPr>
+          <w:color w:val="1E293B"/>
+          <w:sz w:val="21"/>
+          <w:szCs w:val="21"/>
+        </w:rPr>
+        <w:t xml:space="preserve"> — there is no server, database or system integration; every figure shown is synthetic demonstration data generated in the browser, and every AI response is simulated locally. Section 7 details the mock architecture and Appendix A provides annotated screenshots of each view.</w:t>
+      </w:r>
+    </w:p>
+    <w:p>
+      <w:pPr>
+        <w:spacing w:after="120" w:line="300"/>
+      </w:pPr>
+      <w:r>
+        <w:rPr>
+          <w:color w:val="1E293B"/>
+          <w:sz w:val="21"/>
+          <w:szCs w:val="21"/>
+        </w:rPr>
+        <w:t xml:space="preserve">This document baselines the scope, personas, features, AI capabilities, requirements, specification, prerequisites, security posture, limitations and outcomes of the current release, fully aligned to the client feedback received on 12 July 2026 and the reviewer confirmations of 15 July 2026.</w:t>
       </w:r>
     </w:p>
     <w:p>
@@ -3398,7 +3640,7 @@
           <w:sz w:val="21"/>
           <w:szCs w:val="21"/>
         </w:rPr>
-        <w:t xml:space="preserve">Patient list with risk levels, vitals, timeline, prescriptions and lab results, plus an AI Copilot (demo) producing simulated consultation summaries, ICD-10 code suggestions, abnormal-vitals highlights, drug-interaction checks, SOAP notes, referral letters and discharge summaries.</w:t>
+        <w:t xml:space="preserve">Patient list with active conditions, vitals with normal-range flags, patient timeline, prescriptions and lab results, plus an AI Copilot (demo) producing simulated consultation summaries, ICD-10 code suggestions, abnormal-vitals highlights, drug-interaction checks, SOAP notes, referral letters and discharge summaries. Per the reviewer confirmations, no numeric risk scores or department information is displayed. (Figure 5.)</w:t>
       </w:r>
     </w:p>
     <w:p>
@@ -3420,7 +3662,7 @@
           <w:sz w:val="21"/>
           <w:szCs w:val="21"/>
         </w:rPr>
-        <w:t xml:space="preserve">Personal health overview: vitals, wellness view, appointments, prescriptions with refill reminders, claims history and notifications.</w:t>
+        <w:t xml:space="preserve">Personal health overview: upcoming appointments, digital prescriptions with refill progress, medicine and vaccination reminders, outpatient claims history in RM, and medical history. Per the reviewer confirmations, no personal health score, wellness score or lifestyle score is shown. (Figure 6.)</w:t>
       </w:r>
     </w:p>
     <w:p>
@@ -3484,6 +3726,42 @@
           <w:szCs w:val="21"/>
         </w:rPr>
         <w:t xml:space="preserve">Generated claim documents rendered on demand (no stored PHI files in the demo).</w:t>
+      </w:r>
+    </w:p>
+    <w:p>
+      <w:pPr>
+        <w:spacing w:after="120" w:line="300"/>
+      </w:pPr>
+      <w:r>
+        <w:rPr>
+          <w:color w:val="1E293B"/>
+          <w:sz w:val="21"/>
+          <w:szCs w:val="21"/>
+        </w:rPr>
+        <w:t xml:space="preserve"/>
+      </w:r>
+    </w:p>
+    <w:p>
+      <w:pPr>
+        <w:spacing w:after="120" w:line="300"/>
+      </w:pPr>
+      <w:r>
+        <w:rPr>
+          <w:b/>
+          <w:bCs/>
+          <w:color w:val="1E293B"/>
+          <w:sz w:val="21"/>
+          <w:szCs w:val="21"/>
+        </w:rPr>
+        <w:t xml:space="preserve">Feature coverage vs. the confirmed current-phase scope: </w:t>
+      </w:r>
+      <w:r>
+        <w:rPr>
+          <w:color w:val="1E293B"/>
+          <w:sz w:val="21"/>
+          <w:szCs w:val="21"/>
+        </w:rPr>
+        <w:t xml:space="preserve">outpatient claims summary (KPI cards), claim amount analysis (payment-type chart, per-employee table and drill-down), utilization reporting (claims per employee, tier utilisation, report utilisation metrics), and basic reporting (HR Intelligence Reports panel). Annotated screenshots of every view are provided in Appendix A.</w:t>
       </w:r>
     </w:p>
     <w:p>
@@ -7067,7 +7345,7 @@
                 <w:sz w:val="19"/>
                 <w:szCs w:val="19"/>
               </w:rPr>
-              <w:t xml:space="preserve">AI assistant</w:t>
+              <w:t xml:space="preserve">Backend / APIs</w:t>
             </w:r>
           </w:p>
         </w:tc>
@@ -7098,7 +7376,7 @@
                 <w:sz w:val="19"/>
                 <w:szCs w:val="19"/>
               </w:rPr>
-              <w:t xml:space="preserve">Local mock response engine (no external calls, no API keys)</w:t>
+              <w:t xml:space="preserve">None — the backend is completely mocked. No server, no database, no authentication service and no external API of any kind; all data is defined in typed in-browser datasets</w:t>
             </w:r>
           </w:p>
         </w:tc>
@@ -7130,6 +7408,69 @@
                 <w:sz w:val="19"/>
                 <w:szCs w:val="19"/>
               </w:rPr>
+              <w:t xml:space="preserve">AI assistant</w:t>
+            </w:r>
+          </w:p>
+        </w:tc>
+        <w:tc>
+          <w:tcPr>
+            <w:tcW w:type="dxa" w:w="6626"/>
+            <w:tcBorders>
+              <w:top w:val="single" w:color="CBD5E1" w:sz="4"/>
+              <w:left w:val="single" w:color="CBD5E1" w:sz="4"/>
+              <w:bottom w:val="single" w:color="CBD5E1" w:sz="4"/>
+              <w:right w:val="single" w:color="CBD5E1" w:sz="4"/>
+            </w:tcBorders>
+            <w:tcMar>
+              <w:top w:type="dxa" w:w="80"/>
+              <w:left w:type="dxa" w:w="120"/>
+              <w:bottom w:type="dxa" w:w="80"/>
+              <w:right w:type="dxa" w:w="120"/>
+            </w:tcMar>
+          </w:tcPr>
+          <w:p>
+            <w:pPr>
+              <w:spacing w:after="0" w:line="260"/>
+            </w:pPr>
+            <w:r>
+              <w:rPr>
+                <w:color w:val="1E293B"/>
+                <w:sz w:val="19"/>
+                <w:szCs w:val="19"/>
+              </w:rPr>
+              <w:t xml:space="preserve">Local mock response engine (no external calls, no API keys)</w:t>
+            </w:r>
+          </w:p>
+        </w:tc>
+      </w:tr>
+      <w:tr>
+        <w:tc>
+          <w:tcPr>
+            <w:tcW w:type="dxa" w:w="2400"/>
+            <w:tcBorders>
+              <w:top w:val="single" w:color="CBD5E1" w:sz="4"/>
+              <w:left w:val="single" w:color="CBD5E1" w:sz="4"/>
+              <w:bottom w:val="single" w:color="CBD5E1" w:sz="4"/>
+              <w:right w:val="single" w:color="CBD5E1" w:sz="4"/>
+            </w:tcBorders>
+            <w:shd w:fill="F1F5F9" w:val="clear"/>
+            <w:tcMar>
+              <w:top w:type="dxa" w:w="80"/>
+              <w:left w:type="dxa" w:w="120"/>
+              <w:bottom w:type="dxa" w:w="80"/>
+              <w:right w:type="dxa" w:w="120"/>
+            </w:tcMar>
+          </w:tcPr>
+          <w:p>
+            <w:pPr>
+              <w:spacing w:after="0" w:line="260"/>
+            </w:pPr>
+            <w:r>
+              <w:rPr>
+                <w:color w:val="1E293B"/>
+                <w:sz w:val="19"/>
+                <w:szCs w:val="19"/>
+              </w:rPr>
               <w:t xml:space="preserve">Hosting model</w:t>
             </w:r>
           </w:p>
@@ -7143,24 +7484,25 @@
               <w:bottom w:val="single" w:color="CBD5E1" w:sz="4"/>
               <w:right w:val="single" w:color="CBD5E1" w:sz="4"/>
             </w:tcBorders>
-            <w:tcMar>
-              <w:top w:type="dxa" w:w="80"/>
-              <w:left w:type="dxa" w:w="120"/>
-              <w:bottom w:type="dxa" w:w="80"/>
-              <w:right w:type="dxa" w:w="120"/>
-            </w:tcMar>
-          </w:tcPr>
-          <w:p>
-            <w:pPr>
-              <w:spacing w:after="0" w:line="260"/>
-            </w:pPr>
-            <w:r>
-              <w:rPr>
-                <w:color w:val="1E293B"/>
-                <w:sz w:val="19"/>
-                <w:szCs w:val="19"/>
-              </w:rPr>
-              <w:t xml:space="preserve">Static SPA build (dist/) deployable to any static host; SPA redirects included</w:t>
+            <w:shd w:fill="F1F5F9" w:val="clear"/>
+            <w:tcMar>
+              <w:top w:type="dxa" w:w="80"/>
+              <w:left w:type="dxa" w:w="120"/>
+              <w:bottom w:type="dxa" w:w="80"/>
+              <w:right w:type="dxa" w:w="120"/>
+            </w:tcMar>
+          </w:tcPr>
+          <w:p>
+            <w:pPr>
+              <w:spacing w:after="0" w:line="260"/>
+            </w:pPr>
+            <w:r>
+              <w:rPr>
+                <w:color w:val="1E293B"/>
+                <w:sz w:val="19"/>
+                <w:szCs w:val="19"/>
+              </w:rPr>
+              <w:t xml:space="preserve">Static SPA build (dist/) deployed via GitHub Pages (GitHub Actions workflow); deployable to any static host</w:t>
             </w:r>
           </w:p>
         </w:tc>
@@ -7769,7 +8111,7 @@
         <w:spacing w:after="120" w:before="240"/>
       </w:pPr>
       <w:r>
-        <w:t xml:space="preserve">7.3 Demo Dataset</w:t>
+        <w:t xml:space="preserve">7.3 Demo Dataset (Mock Backend)</w:t>
       </w:r>
     </w:p>
     <w:p>
@@ -7782,7 +8124,7 @@
           <w:sz w:val="21"/>
           <w:szCs w:val="21"/>
         </w:rPr>
-        <w:t xml:space="preserve">The current release ships with an illustrative dataset: 30 outpatient claims across 14 employees for the current month (RM3,320 total; 3 employees over tier limits), and report datasets for H1 2026 (1,250 claims), Q2 2026 (680 claims) and Q1 2026 (42 claims — demonstrating threshold suppression). Figures are representative, not actuals.</w:t>
+        <w:t xml:space="preserve">Because the backend is completely mocked, the application ships with an illustrative in-browser dataset: 30 outpatient claims across 14 employees for the current month (RM3,320 total; 3 employees over tier limits), and report datasets for H1 2026 (1,250 claims), Q2 2026 (680 claims) and Q1 2026 (42 claims — demonstrating threshold suppression). All patients, doctors, providers, prescriptions and lab results are likewise synthetic. Figures are representative, not actuals, and reset on every page reload.</w:t>
       </w:r>
     </w:p>
     <w:p>
@@ -8618,11 +8960,13 @@
       </w:pPr>
       <w:r>
         <w:rPr>
+          <w:b/>
+          <w:bCs/>
           <w:color w:val="1E293B"/>
           <w:sz w:val="21"/>
           <w:szCs w:val="21"/>
         </w:rPr>
-        <w:t xml:space="preserve">Demonstration system: all data is synthetic and volumes are illustrative (the monthly view and the report periods are intentionally different datasets).</w:t>
+        <w:t xml:space="preserve">The backend is completely mocked: no server, no database, no integrations — all data is synthetic, lives in the browser, and volumes are illustrative (the monthly view and the report periods are intentionally different datasets).</w:t>
       </w:r>
     </w:p>
     <w:p>
@@ -9239,6 +9583,420 @@
         </w:tc>
       </w:tr>
     </w:tbl>
+    <w:p>
+      <w:r>
+        <w:br w:type="page"/>
+      </w:r>
+    </w:p>
+    <w:p>
+      <w:pPr>
+        <w:pStyle w:val="Heading1"/>
+        <w:spacing w:after="160" w:before="360"/>
+      </w:pPr>
+      <w:r>
+        <w:t xml:space="preserve">12. Appendix A — Feature Walkthrough (Screenshots)</w:t>
+      </w:r>
+    </w:p>
+    <w:p>
+      <w:pPr>
+        <w:spacing w:after="120" w:line="300"/>
+      </w:pPr>
+      <w:r>
+        <w:rPr>
+          <w:color w:val="1E293B"/>
+          <w:sz w:val="21"/>
+          <w:szCs w:val="21"/>
+        </w:rPr>
+        <w:t xml:space="preserve">Screenshots captured from the running application (v1.1, 16 Jul 2026). All figures show mock demonstration data rendered by the fully mocked in-browser backend.</w:t>
+      </w:r>
+    </w:p>
+    <w:p>
+      <w:pPr>
+        <w:spacing w:after="60" w:before="120"/>
+        <w:jc w:val="center"/>
+      </w:pPr>
+      <w:r>
+        <w:drawing>
+          <wp:inline distT="0" distB="0" distL="0" distR="0">
+            <wp:extent cx="5715000" cy="4362450"/>
+            <wp:effectExtent t="0" r="0" b="0" l="0"/>
+            <wp:docPr id="1" name="" descr="" title=""/>
+            <wp:cNvGraphicFramePr>
+              <a:graphicFrameLocks xmlns:a="http://schemas.openxmlformats.org/drawingml/2006/main" noChangeAspect="1"/>
+            </wp:cNvGraphicFramePr>
+            <a:graphic xmlns:a="http://schemas.openxmlformats.org/drawingml/2006/main">
+              <a:graphicData uri="http://schemas.openxmlformats.org/drawingml/2006/picture">
+                <pic:pic xmlns:pic="http://schemas.openxmlformats.org/drawingml/2006/picture">
+                  <pic:nvPicPr>
+                    <pic:cNvPr id="0" name="" descr=""/>
+                    <pic:cNvPicPr>
+                      <a:picLocks noChangeAspect="1" noChangeArrowheads="1"/>
+                    </pic:cNvPicPr>
+                  </pic:nvPicPr>
+                  <pic:blipFill>
+                    <a:blip r:embed="rId9" cstate="none"/>
+                    <a:srcRect/>
+                    <a:stretch>
+                      <a:fillRect/>
+                    </a:stretch>
+                  </pic:blipFill>
+                  <pic:spPr bwMode="auto">
+                    <a:xfrm>
+                      <a:off x="0" y="0"/>
+                      <a:ext cx="5715000" cy="4362450"/>
+                    </a:xfrm>
+                    <a:prstGeom prst="rect">
+                      <a:avLst/>
+                    </a:prstGeom>
+                  </pic:spPr>
+                </pic:pic>
+              </a:graphicData>
+            </a:graphic>
+          </wp:inline>
+        </w:drawing>
+      </w:r>
+    </w:p>
+    <w:p>
+      <w:pPr>
+        <w:spacing w:after="200"/>
+        <w:jc w:val="center"/>
+      </w:pPr>
+      <w:r>
+        <w:rPr>
+          <w:i/>
+          <w:iCs/>
+          <w:color w:val="475569"/>
+          <w:sz w:val="18"/>
+          <w:szCs w:val="18"/>
+        </w:rPr>
+        <w:t xml:space="preserve">Figure 1: HR Dashboard — outpatient claim KPIs, claims by payment type, claim status, and the per-employee claims table with benefit-tier limits (RM).</w:t>
+      </w:r>
+    </w:p>
+    <w:p>
+      <w:r>
+        <w:br w:type="page"/>
+      </w:r>
+    </w:p>
+    <w:p>
+      <w:pPr>
+        <w:spacing w:after="60" w:before="120"/>
+        <w:jc w:val="center"/>
+      </w:pPr>
+      <w:r>
+        <w:drawing>
+          <wp:inline distT="0" distB="0" distL="0" distR="0">
+            <wp:extent cx="5715000" cy="2286000"/>
+            <wp:effectExtent t="0" r="0" b="0" l="0"/>
+            <wp:docPr id="1" name="" descr="" title=""/>
+            <wp:cNvGraphicFramePr>
+              <a:graphicFrameLocks xmlns:a="http://schemas.openxmlformats.org/drawingml/2006/main" noChangeAspect="1"/>
+            </wp:cNvGraphicFramePr>
+            <a:graphic xmlns:a="http://schemas.openxmlformats.org/drawingml/2006/main">
+              <a:graphicData uri="http://schemas.openxmlformats.org/drawingml/2006/picture">
+                <pic:pic xmlns:pic="http://schemas.openxmlformats.org/drawingml/2006/picture">
+                  <pic:nvPicPr>
+                    <pic:cNvPr id="0" name="" descr=""/>
+                    <pic:cNvPicPr>
+                      <a:picLocks noChangeAspect="1" noChangeArrowheads="1"/>
+                    </pic:cNvPicPr>
+                  </pic:nvPicPr>
+                  <pic:blipFill>
+                    <a:blip r:embed="rId10" cstate="none"/>
+                    <a:srcRect/>
+                    <a:stretch>
+                      <a:fillRect/>
+                    </a:stretch>
+                  </pic:blipFill>
+                  <pic:spPr bwMode="auto">
+                    <a:xfrm>
+                      <a:off x="0" y="0"/>
+                      <a:ext cx="5715000" cy="2286000"/>
+                    </a:xfrm>
+                    <a:prstGeom prst="rect">
+                      <a:avLst/>
+                    </a:prstGeom>
+                  </pic:spPr>
+                </pic:pic>
+              </a:graphicData>
+            </a:graphic>
+          </wp:inline>
+        </w:drawing>
+      </w:r>
+    </w:p>
+    <w:p>
+      <w:pPr>
+        <w:spacing w:after="200"/>
+        <w:jc w:val="center"/>
+      </w:pPr>
+      <w:r>
+        <w:rPr>
+          <w:i/>
+          <w:iCs/>
+          <w:color w:val="475569"/>
+          <w:sz w:val="18"/>
+          <w:szCs w:val="18"/>
+        </w:rPr>
+        <w:t xml:space="preserve">Figure 2: AI Observations &amp; Suggestions Report — period selector and benchmark-judged observations (High side / Acceptable).</w:t>
+      </w:r>
+    </w:p>
+    <w:p>
+      <w:pPr>
+        <w:spacing w:after="60" w:before="120"/>
+        <w:jc w:val="center"/>
+      </w:pPr>
+      <w:r>
+        <w:drawing>
+          <wp:inline distT="0" distB="0" distL="0" distR="0">
+            <wp:extent cx="5715000" cy="3609975"/>
+            <wp:effectExtent t="0" r="0" b="0" l="0"/>
+            <wp:docPr id="1" name="" descr="" title=""/>
+            <wp:cNvGraphicFramePr>
+              <a:graphicFrameLocks xmlns:a="http://schemas.openxmlformats.org/drawingml/2006/main" noChangeAspect="1"/>
+            </wp:cNvGraphicFramePr>
+            <a:graphic xmlns:a="http://schemas.openxmlformats.org/drawingml/2006/main">
+              <a:graphicData uri="http://schemas.openxmlformats.org/drawingml/2006/picture">
+                <pic:pic xmlns:pic="http://schemas.openxmlformats.org/drawingml/2006/picture">
+                  <pic:nvPicPr>
+                    <pic:cNvPr id="0" name="" descr=""/>
+                    <pic:cNvPicPr>
+                      <a:picLocks noChangeAspect="1" noChangeArrowheads="1"/>
+                    </pic:cNvPicPr>
+                  </pic:nvPicPr>
+                  <pic:blipFill>
+                    <a:blip r:embed="rId11" cstate="none"/>
+                    <a:srcRect/>
+                    <a:stretch>
+                      <a:fillRect/>
+                    </a:stretch>
+                  </pic:blipFill>
+                  <pic:spPr bwMode="auto">
+                    <a:xfrm>
+                      <a:off x="0" y="0"/>
+                      <a:ext cx="5715000" cy="3609975"/>
+                    </a:xfrm>
+                    <a:prstGeom prst="rect">
+                      <a:avLst/>
+                    </a:prstGeom>
+                  </pic:spPr>
+                </pic:pic>
+              </a:graphicData>
+            </a:graphic>
+          </wp:inline>
+        </w:drawing>
+      </w:r>
+    </w:p>
+    <w:p>
+      <w:pPr>
+        <w:spacing w:after="200"/>
+        <w:jc w:val="center"/>
+      </w:pPr>
+      <w:r>
+        <w:rPr>
+          <w:i/>
+          <w:iCs/>
+          <w:color w:val="475569"/>
+          <w:sz w:val="18"/>
+          <w:szCs w:val="18"/>
+        </w:rPr>
+        <w:t xml:space="preserve">Figure 3: Report suggestions linked to Health Savvy ecosystem providers, and the top-10 disease table from captured ICD-10 codes.</w:t>
+      </w:r>
+    </w:p>
+    <w:p>
+      <w:r>
+        <w:br w:type="page"/>
+      </w:r>
+    </w:p>
+    <w:p>
+      <w:pPr>
+        <w:spacing w:after="60" w:before="120"/>
+        <w:jc w:val="center"/>
+      </w:pPr>
+      <w:r>
+        <w:drawing>
+          <wp:inline distT="0" distB="0" distL="0" distR="0">
+            <wp:extent cx="5715000" cy="2819400"/>
+            <wp:effectExtent t="0" r="0" b="0" l="0"/>
+            <wp:docPr id="1" name="" descr="" title=""/>
+            <wp:cNvGraphicFramePr>
+              <a:graphicFrameLocks xmlns:a="http://schemas.openxmlformats.org/drawingml/2006/main" noChangeAspect="1"/>
+            </wp:cNvGraphicFramePr>
+            <a:graphic xmlns:a="http://schemas.openxmlformats.org/drawingml/2006/main">
+              <a:graphicData uri="http://schemas.openxmlformats.org/drawingml/2006/picture">
+                <pic:pic xmlns:pic="http://schemas.openxmlformats.org/drawingml/2006/picture">
+                  <pic:nvPicPr>
+                    <pic:cNvPr id="0" name="" descr=""/>
+                    <pic:cNvPicPr>
+                      <a:picLocks noChangeAspect="1" noChangeArrowheads="1"/>
+                    </pic:cNvPicPr>
+                  </pic:nvPicPr>
+                  <pic:blipFill>
+                    <a:blip r:embed="rId12" cstate="none"/>
+                    <a:srcRect/>
+                    <a:stretch>
+                      <a:fillRect/>
+                    </a:stretch>
+                  </pic:blipFill>
+                  <pic:spPr bwMode="auto">
+                    <a:xfrm>
+                      <a:off x="0" y="0"/>
+                      <a:ext cx="5715000" cy="2819400"/>
+                    </a:xfrm>
+                    <a:prstGeom prst="rect">
+                      <a:avLst/>
+                    </a:prstGeom>
+                  </pic:spPr>
+                </pic:pic>
+              </a:graphicData>
+            </a:graphic>
+          </wp:inline>
+        </w:drawing>
+      </w:r>
+    </w:p>
+    <w:p>
+      <w:pPr>
+        <w:spacing w:after="200"/>
+        <w:jc w:val="center"/>
+      </w:pPr>
+      <w:r>
+        <w:rPr>
+          <w:i/>
+          <w:iCs/>
+          <w:color w:val="475569"/>
+          <w:sz w:val="18"/>
+          <w:szCs w:val="18"/>
+        </w:rPr>
+        <w:t xml:space="preserve">Figure 4: Ecosystem wellness services (referral-only) and the honestly-labelled HR Intelligence Reports panel (Rule-based vs AI-planned).</w:t>
+      </w:r>
+    </w:p>
+    <w:p>
+      <w:pPr>
+        <w:spacing w:after="60" w:before="120"/>
+        <w:jc w:val="center"/>
+      </w:pPr>
+      <w:r>
+        <w:drawing>
+          <wp:inline distT="0" distB="0" distL="0" distR="0">
+            <wp:extent cx="5715000" cy="4010025"/>
+            <wp:effectExtent t="0" r="0" b="0" l="0"/>
+            <wp:docPr id="1" name="" descr="" title=""/>
+            <wp:cNvGraphicFramePr>
+              <a:graphicFrameLocks xmlns:a="http://schemas.openxmlformats.org/drawingml/2006/main" noChangeAspect="1"/>
+            </wp:cNvGraphicFramePr>
+            <a:graphic xmlns:a="http://schemas.openxmlformats.org/drawingml/2006/main">
+              <a:graphicData uri="http://schemas.openxmlformats.org/drawingml/2006/picture">
+                <pic:pic xmlns:pic="http://schemas.openxmlformats.org/drawingml/2006/picture">
+                  <pic:nvPicPr>
+                    <pic:cNvPr id="0" name="" descr=""/>
+                    <pic:cNvPicPr>
+                      <a:picLocks noChangeAspect="1" noChangeArrowheads="1"/>
+                    </pic:cNvPicPr>
+                  </pic:nvPicPr>
+                  <pic:blipFill>
+                    <a:blip r:embed="rId13" cstate="none"/>
+                    <a:srcRect/>
+                    <a:stretch>
+                      <a:fillRect/>
+                    </a:stretch>
+                  </pic:blipFill>
+                  <pic:spPr bwMode="auto">
+                    <a:xfrm>
+                      <a:off x="0" y="0"/>
+                      <a:ext cx="5715000" cy="4010025"/>
+                    </a:xfrm>
+                    <a:prstGeom prst="rect">
+                      <a:avLst/>
+                    </a:prstGeom>
+                  </pic:spPr>
+                </pic:pic>
+              </a:graphicData>
+            </a:graphic>
+          </wp:inline>
+        </w:drawing>
+      </w:r>
+    </w:p>
+    <w:p>
+      <w:pPr>
+        <w:spacing w:after="200"/>
+        <w:jc w:val="center"/>
+      </w:pPr>
+      <w:r>
+        <w:rPr>
+          <w:i/>
+          <w:iCs/>
+          <w:color w:val="475569"/>
+          <w:sz w:val="18"/>
+          <w:szCs w:val="18"/>
+        </w:rPr>
+        <w:t xml:space="preserve">Figure 5: Doctor Workspace — patient list with conditions, vitals with range flags, timeline, prescriptions, labs, and the AI Copilot (demo). No risk scores or departments shown.</w:t>
+      </w:r>
+    </w:p>
+    <w:p>
+      <w:r>
+        <w:br w:type="page"/>
+      </w:r>
+    </w:p>
+    <w:p>
+      <w:pPr>
+        <w:spacing w:after="60" w:before="120"/>
+        <w:jc w:val="center"/>
+      </w:pPr>
+      <w:r>
+        <w:drawing>
+          <wp:inline distT="0" distB="0" distL="0" distR="0">
+            <wp:extent cx="5715000" cy="5200650"/>
+            <wp:effectExtent t="0" r="0" b="0" l="0"/>
+            <wp:docPr id="1" name="" descr="" title=""/>
+            <wp:cNvGraphicFramePr>
+              <a:graphicFrameLocks xmlns:a="http://schemas.openxmlformats.org/drawingml/2006/main" noChangeAspect="1"/>
+            </wp:cNvGraphicFramePr>
+            <a:graphic xmlns:a="http://schemas.openxmlformats.org/drawingml/2006/main">
+              <a:graphicData uri="http://schemas.openxmlformats.org/drawingml/2006/picture">
+                <pic:pic xmlns:pic="http://schemas.openxmlformats.org/drawingml/2006/picture">
+                  <pic:nvPicPr>
+                    <pic:cNvPr id="0" name="" descr=""/>
+                    <pic:cNvPicPr>
+                      <a:picLocks noChangeAspect="1" noChangeArrowheads="1"/>
+                    </pic:cNvPicPr>
+                  </pic:nvPicPr>
+                  <pic:blipFill>
+                    <a:blip r:embed="rId14" cstate="none"/>
+                    <a:srcRect/>
+                    <a:stretch>
+                      <a:fillRect/>
+                    </a:stretch>
+                  </pic:blipFill>
+                  <pic:spPr bwMode="auto">
+                    <a:xfrm>
+                      <a:off x="0" y="0"/>
+                      <a:ext cx="5715000" cy="5200650"/>
+                    </a:xfrm>
+                    <a:prstGeom prst="rect">
+                      <a:avLst/>
+                    </a:prstGeom>
+                  </pic:spPr>
+                </pic:pic>
+              </a:graphicData>
+            </a:graphic>
+          </wp:inline>
+        </w:drawing>
+      </w:r>
+    </w:p>
+    <w:p>
+      <w:pPr>
+        <w:spacing w:after="200"/>
+        <w:jc w:val="center"/>
+      </w:pPr>
+      <w:r>
+        <w:rPr>
+          <w:i/>
+          <w:iCs/>
+          <w:color w:val="475569"/>
+          <w:sz w:val="18"/>
+          <w:szCs w:val="18"/>
+        </w:rPr>
+        <w:t xml:space="preserve">Figure 6: Patient Portal — appointments, prescriptions, reminders, outpatient claims in RM, and medical history. No personal health or wellness scores shown.</w:t>
+      </w:r>
+    </w:p>
     <w:p>
       <w:pPr>
         <w:spacing w:after="120" w:line="300"/>

</xml_diff>